<commit_message>
add lab02 images and final files
</commit_message>
<xml_diff>
--- a/labs/lab02/report/arch-pc-lab02-report.docx
+++ b/labs/lab02/report/arch-pc-lab02-report.docx
@@ -78,118 +78,6 @@
       </w:r>
       <w:r>
         <w:t xml:space="preserve">Владимировна</w:t>
-      </w:r>
-    </w:p>
-    <w:p>
-      <w:pPr>
-        <w:pStyle w:val="AbstractTitle"/>
-      </w:pPr>
-      <w:r>
-        <w:t xml:space="preserve">Аннотация</w:t>
-      </w:r>
-    </w:p>
-    <w:p>
-      <w:pPr>
-        <w:pStyle w:val="Abstract"/>
-      </w:pPr>
-      <w:r>
-        <w:t xml:space="preserve">В</w:t>
-      </w:r>
-      <w:r>
-        <w:t xml:space="preserve"> </w:t>
-      </w:r>
-      <w:r>
-        <w:t xml:space="preserve">данном</w:t>
-      </w:r>
-      <w:r>
-        <w:t xml:space="preserve"> </w:t>
-      </w:r>
-      <w:r>
-        <w:t xml:space="preserve">отчете</w:t>
-      </w:r>
-      <w:r>
-        <w:t xml:space="preserve"> </w:t>
-      </w:r>
-      <w:r>
-        <w:t xml:space="preserve">представлены</w:t>
-      </w:r>
-      <w:r>
-        <w:t xml:space="preserve"> </w:t>
-      </w:r>
-      <w:r>
-        <w:t xml:space="preserve">результаты</w:t>
-      </w:r>
-      <w:r>
-        <w:t xml:space="preserve"> </w:t>
-      </w:r>
-      <w:r>
-        <w:t xml:space="preserve">выполнения</w:t>
-      </w:r>
-      <w:r>
-        <w:t xml:space="preserve"> </w:t>
-      </w:r>
-      <w:r>
-        <w:t xml:space="preserve">лабораторной</w:t>
-      </w:r>
-      <w:r>
-        <w:t xml:space="preserve"> </w:t>
-      </w:r>
-      <w:r>
-        <w:t xml:space="preserve">работы</w:t>
-      </w:r>
-      <w:r>
-        <w:t xml:space="preserve"> </w:t>
-      </w:r>
-      <w:r>
-        <w:t xml:space="preserve">2,</w:t>
-      </w:r>
-      <w:r>
-        <w:t xml:space="preserve"> </w:t>
-      </w:r>
-      <w:r>
-        <w:t xml:space="preserve">посвященной</w:t>
-      </w:r>
-      <w:r>
-        <w:t xml:space="preserve"> </w:t>
-      </w:r>
-      <w:r>
-        <w:t xml:space="preserve">изучению</w:t>
-      </w:r>
-      <w:r>
-        <w:t xml:space="preserve"> </w:t>
-      </w:r>
-      <w:r>
-        <w:t xml:space="preserve">идеологии</w:t>
-      </w:r>
-      <w:r>
-        <w:t xml:space="preserve"> </w:t>
-      </w:r>
-      <w:r>
-        <w:t xml:space="preserve">и</w:t>
-      </w:r>
-      <w:r>
-        <w:t xml:space="preserve"> </w:t>
-      </w:r>
-      <w:r>
-        <w:t xml:space="preserve">применению</w:t>
-      </w:r>
-      <w:r>
-        <w:t xml:space="preserve"> </w:t>
-      </w:r>
-      <w:r>
-        <w:t xml:space="preserve">средств</w:t>
-      </w:r>
-      <w:r>
-        <w:t xml:space="preserve"> </w:t>
-      </w:r>
-      <w:r>
-        <w:t xml:space="preserve">контроля</w:t>
-      </w:r>
-      <w:r>
-        <w:t xml:space="preserve"> </w:t>
-      </w:r>
-      <w:r>
-        <w:t xml:space="preserve">версий.</w:t>
       </w:r>
     </w:p>
     <w:sdt>
@@ -232,7 +120,7 @@
         <w:pStyle w:val="FirstParagraph"/>
       </w:pPr>
       <w:r>
-        <w:t xml:space="preserve">Изучение идеологии и применения средств контроля версий, приобретение практических навыков по работе с системой контроля версий git.</w:t>
+        <w:t xml:space="preserve">Целью работы является изучение идеологии и применения средств контроля версий, приобретение практических навыков по работе с системой контроля версий git.</w:t>
       </w:r>
     </w:p>
     <w:bookmarkEnd w:id="20"/>
@@ -268,11 +156,11 @@
         <w:pStyle w:val="FirstParagraph"/>
       </w:pPr>
       <w:r>
-        <w:t xml:space="preserve">Для выполнения лабораторной работы я использовала домашний ноутбук Apple MacBook на процессоре Apple Silicon с виртуальной машиной Ubuntu Linux, запущенной через приложение UTM, а также встроенный терминал, систему контроля версий Git и платформы Git.</w:t>
+        <w:t xml:space="preserve">Для выполнения лабораторной работы я использовала домашний ноутбук Apple MacBook на процессоре Apple Silicon с виртуальной машиной Ubuntu Linux, запущенной через приложение UTM, а также встроенный терминал, систему контроля версий Git и платформы Git (включая удаленный репозиторий на GitHub).</w:t>
       </w:r>
     </w:p>
     <w:bookmarkEnd w:id="22"/>
-    <w:bookmarkStart w:id="29" w:name="выполнение-лабораторной-работы"/>
+    <w:bookmarkStart w:id="80" w:name="выполнение-лабораторной-работы"/>
     <w:p>
       <w:pPr>
         <w:pStyle w:val="Heading1"/>
@@ -303,7 +191,7 @@
       </w:r>
     </w:p>
     <w:bookmarkEnd w:id="23"/>
-    <w:bookmarkStart w:id="25" w:name="базовая-настройка-git"/>
+    <w:bookmarkStart w:id="40" w:name="базовая-настройка-git"/>
     <w:p>
       <w:pPr>
         <w:pStyle w:val="Heading2"/>
@@ -318,134 +206,103 @@
           <w:ilvl w:val="0"/>
           <w:numId w:val="1002"/>
         </w:numPr>
-      </w:pPr>
-      <w:r>
-        <w:t xml:space="preserve">Начинаю с предварительной конфигурации git. Открываю терминал и ввожу команды, указывая свое имя и свой адрес эл.почты.</w:t>
-      </w:r>
-      <w:r>
-        <w:t xml:space="preserve"> </w:t>
-      </w:r>
-      <w:r>
-        <w:t xml:space="preserve">uvzorova@ubuntu:~$ git config –global user.name</w:t>
-      </w:r>
-      <w:r>
-        <w:t xml:space="preserve"> </w:t>
-      </w:r>
-      <w:r>
-        <w:t xml:space="preserve">“</w:t>
-      </w:r>
-      <w:r>
-        <w:t xml:space="preserve">”</w:t>
-      </w:r>
-      <w:r>
-        <w:t xml:space="preserve"> </w:t>
-      </w:r>
-      <w:r>
-        <w:t xml:space="preserve">uvzorova@ubuntu:~$ git config –global user.email</w:t>
-      </w:r>
-      <w:r>
-        <w:t xml:space="preserve"> </w:t>
-      </w:r>
-      <w:r>
-        <w:t xml:space="preserve">“</w:t>
-      </w:r>
-      <w:hyperlink r:id="rId24">
+        <w:pStyle w:val="Compact"/>
+      </w:pPr>
+      <w:r>
+        <w:t xml:space="preserve">Начинаю с предварительной конфигурации git. Открываю терминал и ввожу команды, указывая свое имя и свой адрес эл.почты (</w:t>
+      </w:r>
+      <w:hyperlink w:anchor="fig-1">
         <w:r>
           <w:rPr>
             <w:rStyle w:val="Hyperlink"/>
           </w:rPr>
-          <w:t xml:space="preserve">1132260180@rudn.ru</w:t>
+          <w:t xml:space="preserve">Рисунок 1</w:t>
         </w:r>
       </w:hyperlink>
       <w:r>
-        <w:t xml:space="preserve">”</w:t>
+        <w:t xml:space="preserve">).</w:t>
       </w:r>
     </w:p>
-    <w:p>
-      <w:pPr>
-        <w:numPr>
-          <w:ilvl w:val="0"/>
-          <w:numId w:val="1002"/>
-        </w:numPr>
-      </w:pPr>
-      <w:r>
-        <w:t xml:space="preserve">Настраиваю utf-8, имя начальной ветки, параметр autocrlf, параметр safecrlf.</w:t>
-      </w:r>
-      <w:r>
-        <w:t xml:space="preserve"> </w:t>
-      </w:r>
-      <w:r>
-        <w:t xml:space="preserve">uvzorova@ubuntu:~$ git config –global core.quotepath false</w:t>
-      </w:r>
-      <w:r>
-        <w:t xml:space="preserve"> </w:t>
-      </w:r>
-      <w:r>
-        <w:t xml:space="preserve">uvzorova@ubuntu:~$ git config –global init.defaultBranch master</w:t>
-      </w:r>
-      <w:r>
-        <w:t xml:space="preserve"> </w:t>
-      </w:r>
-      <w:r>
-        <w:t xml:space="preserve">uvzorova@ubuntu:~$ git config –global core.autocrlf input</w:t>
-      </w:r>
-      <w:r>
-        <w:t xml:space="preserve"> </w:t>
-      </w:r>
-      <w:r>
-        <w:t xml:space="preserve">uvzorova@ubuntu:~$ git config –global core.safecrlf warn</w:t>
-      </w:r>
-    </w:p>
-    <w:p>
-      <w:pPr>
-        <w:numPr>
-          <w:ilvl w:val="0"/>
-          <w:numId w:val="1002"/>
-        </w:numPr>
-      </w:pPr>
-      <w:r>
-        <w:t xml:space="preserve">Создаю SSH-ключ (пару ключей) для идентификации на сервере репозиториев.</w:t>
-      </w:r>
-      <w:r>
-        <w:t xml:space="preserve"> </w:t>
-      </w:r>
-      <w:r>
-        <w:t xml:space="preserve">uvzorova@ubuntu:~$ ssh-keygen -t ed25519 -C</w:t>
-      </w:r>
-      <w:r>
-        <w:t xml:space="preserve"> </w:t>
-      </w:r>
-      <w:r>
-        <w:t xml:space="preserve">“</w:t>
-      </w:r>
-      <w:r>
-        <w:t xml:space="preserve">1132260180@rudn.ru</w:t>
-      </w:r>
-      <w:r>
-        <w:t xml:space="preserve">”</w:t>
-      </w:r>
-    </w:p>
-    <w:p>
-      <w:pPr>
-        <w:numPr>
-          <w:ilvl w:val="0"/>
-          <w:numId w:val="1002"/>
-        </w:numPr>
-      </w:pPr>
-      <w:r>
-        <w:t xml:space="preserve">Перехожу на сайт GitHub, в настройках выбираю вкладку Ключи SSH/GPG, добавляю созданный ключ.</w:t>
-      </w:r>
-    </w:p>
-    <w:bookmarkEnd w:id="25"/>
-    <w:bookmarkStart w:id="26" w:name="X5d7ac97f7da9f01eccc91742a7b9d4c637f265e"/>
-    <w:p>
-      <w:pPr>
-        <w:pStyle w:val="Heading2"/>
-      </w:pPr>
-      <w:r>
-        <w:t xml:space="preserve">4.3 Создание рабочего пространства и репозитория курса</w:t>
-      </w:r>
-    </w:p>
+    <w:tbl>
+      <w:tblPr>
+        <w:tblStyle w:val="Table"/>
+        <w:tblW w:type="pct" w:w="5000"/>
+        <w:tblLook w:firstRow="0" w:lastRow="0" w:firstColumn="0" w:lastColumn="0" w:noHBand="0" w:noVBand="0" w:val="0000"/>
+        <w:jc w:val="start"/>
+        <w:tblLayout w:type="fixed"/>
+      </w:tblPr>
+      <w:tblGrid>
+        <w:gridCol w:w="7920"/>
+      </w:tblGrid>
+      <w:tr>
+        <w:tc>
+          <w:tcPr/>
+          <w:bookmarkStart w:id="27" w:name="fig-1"/>
+          <w:p>
+            <w:pPr>
+              <w:pStyle w:val="Compact"/>
+              <w:jc w:val="center"/>
+            </w:pPr>
+            <w:r>
+              <w:drawing>
+                <wp:inline>
+                  <wp:extent cx="4267200" cy="299176"/>
+                  <wp:effectExtent b="0" l="0" r="0" t="0"/>
+                  <wp:docPr descr="" title="" id="25" name="Picture"/>
+                  <a:graphic>
+                    <a:graphicData uri="http://schemas.openxmlformats.org/drawingml/2006/picture">
+                      <pic:pic>
+                        <pic:nvPicPr>
+                          <pic:cNvPr descr="image/1.png" id="26" name="Picture"/>
+                          <pic:cNvPicPr>
+                            <a:picLocks noChangeArrowheads="1" noChangeAspect="1"/>
+                          </pic:cNvPicPr>
+                        </pic:nvPicPr>
+                        <pic:blipFill>
+                          <a:blip r:embed="rId24"/>
+                          <a:stretch>
+                            <a:fillRect/>
+                          </a:stretch>
+                        </pic:blipFill>
+                        <pic:spPr bwMode="auto">
+                          <a:xfrm>
+                            <a:off x="0" y="0"/>
+                            <a:ext cx="4267200" cy="299176"/>
+                          </a:xfrm>
+                          <a:prstGeom prst="rect">
+                            <a:avLst/>
+                          </a:prstGeom>
+                          <a:noFill/>
+                          <a:ln w="9525">
+                            <a:noFill/>
+                            <a:headEnd/>
+                            <a:tailEnd/>
+                          </a:ln>
+                        </pic:spPr>
+                      </pic:pic>
+                    </a:graphicData>
+                  </a:graphic>
+                </wp:inline>
+              </w:drawing>
+            </w:r>
+          </w:p>
+          <w:p>
+            <w:pPr>
+              <w:jc w:val="center"/>
+            </w:pPr>
+            <w:pPr>
+              <w:jc w:val="start"/>
+              <w:spacing w:before="200"/>
+              <w:pStyle w:val="ImageCaption"/>
+            </w:pPr>
+            <w:r>
+              <w:t xml:space="preserve">Рисунок 1: Настройка имени и почты</w:t>
+            </w:r>
+          </w:p>
+          <w:bookmarkEnd w:id="27"/>
+        </w:tc>
+      </w:tr>
+    </w:tbl>
     <w:p>
       <w:pPr>
         <w:numPr>
@@ -455,178 +312,1282 @@
         <w:pStyle w:val="Compact"/>
       </w:pPr>
       <w:r>
-        <w:t xml:space="preserve">Создаю структуру рабочих каталогов для учебных материалов.</w:t>
-      </w:r>
-      <w:r>
-        <w:t xml:space="preserve"> </w:t>
-      </w:r>
-      <w:r>
-        <w:t xml:space="preserve">uvzorova@ubuntu:~$ mkdir -p ~/work/study/2026-2027/</w:t>
-      </w:r>
-      <w:r>
-        <w:t xml:space="preserve">“</w:t>
-      </w:r>
-      <w:r>
-        <w:t xml:space="preserve">Архитектура компьютера</w:t>
-      </w:r>
-      <w:r>
-        <w:t xml:space="preserve">”</w:t>
+        <w:t xml:space="preserve">Настраиваю utf-8, имя начальной ветки, параметр autocrlf, параметр safecrlf (</w:t>
+      </w:r>
+      <w:hyperlink w:anchor="fig-2">
+        <w:r>
+          <w:rPr>
+            <w:rStyle w:val="Hyperlink"/>
+          </w:rPr>
+          <w:t xml:space="preserve">Рисунок 2</w:t>
+        </w:r>
+      </w:hyperlink>
+      <w:r>
+        <w:t xml:space="preserve">).</w:t>
       </w:r>
     </w:p>
-    <w:bookmarkEnd w:id="26"/>
-    <w:bookmarkStart w:id="27" w:name="X358c05152c0b5375b00f51c960276c4e3312eeb"/>
-    <w:p>
-      <w:pPr>
-        <w:pStyle w:val="Heading2"/>
-      </w:pPr>
-      <w:r>
-        <w:t xml:space="preserve">4.4 Создание репозитория курса на основе шаблона</w:t>
-      </w:r>
-    </w:p>
+    <w:tbl>
+      <w:tblPr>
+        <w:tblStyle w:val="Table"/>
+        <w:tblW w:type="pct" w:w="5000"/>
+        <w:tblLook w:firstRow="0" w:lastRow="0" w:firstColumn="0" w:lastColumn="0" w:noHBand="0" w:noVBand="0" w:val="0000"/>
+        <w:jc w:val="start"/>
+        <w:tblLayout w:type="fixed"/>
+      </w:tblPr>
+      <w:tblGrid>
+        <w:gridCol w:w="7920"/>
+      </w:tblGrid>
+      <w:tr>
+        <w:tc>
+          <w:tcPr/>
+          <w:bookmarkStart w:id="31" w:name="fig-2"/>
+          <w:p>
+            <w:pPr>
+              <w:pStyle w:val="Compact"/>
+              <w:jc w:val="center"/>
+            </w:pPr>
+            <w:r>
+              <w:drawing>
+                <wp:inline>
+                  <wp:extent cx="4267200" cy="606203"/>
+                  <wp:effectExtent b="0" l="0" r="0" t="0"/>
+                  <wp:docPr descr="" title="" id="29" name="Picture"/>
+                  <a:graphic>
+                    <a:graphicData uri="http://schemas.openxmlformats.org/drawingml/2006/picture">
+                      <pic:pic>
+                        <pic:nvPicPr>
+                          <pic:cNvPr descr="image/2.png" id="30" name="Picture"/>
+                          <pic:cNvPicPr>
+                            <a:picLocks noChangeArrowheads="1" noChangeAspect="1"/>
+                          </pic:cNvPicPr>
+                        </pic:nvPicPr>
+                        <pic:blipFill>
+                          <a:blip r:embed="rId28"/>
+                          <a:stretch>
+                            <a:fillRect/>
+                          </a:stretch>
+                        </pic:blipFill>
+                        <pic:spPr bwMode="auto">
+                          <a:xfrm>
+                            <a:off x="0" y="0"/>
+                            <a:ext cx="4267200" cy="606203"/>
+                          </a:xfrm>
+                          <a:prstGeom prst="rect">
+                            <a:avLst/>
+                          </a:prstGeom>
+                          <a:noFill/>
+                          <a:ln w="9525">
+                            <a:noFill/>
+                            <a:headEnd/>
+                            <a:tailEnd/>
+                          </a:ln>
+                        </pic:spPr>
+                      </pic:pic>
+                    </a:graphicData>
+                  </a:graphic>
+                </wp:inline>
+              </w:drawing>
+            </w:r>
+          </w:p>
+          <w:p>
+            <w:pPr>
+              <w:jc w:val="center"/>
+            </w:pPr>
+            <w:pPr>
+              <w:jc w:val="start"/>
+              <w:spacing w:before="200"/>
+              <w:pStyle w:val="ImageCaption"/>
+            </w:pPr>
+            <w:r>
+              <w:t xml:space="preserve">Рисунок 2: Настройка параметров git</w:t>
+            </w:r>
+          </w:p>
+          <w:bookmarkEnd w:id="31"/>
+        </w:tc>
+      </w:tr>
+    </w:tbl>
     <w:p>
       <w:pPr>
         <w:numPr>
           <w:ilvl w:val="0"/>
           <w:numId w:val="1004"/>
         </w:numPr>
-      </w:pPr>
-      <w:r>
-        <w:t xml:space="preserve">Создаю репозиторий на основе имеющегося шаблона в GitVerse.</w:t>
+        <w:pStyle w:val="Compact"/>
+      </w:pPr>
+      <w:r>
+        <w:t xml:space="preserve">Создаю SSH-ключ (пару ключей) для идентификации на сервере репозиториев (</w:t>
+      </w:r>
+      <w:hyperlink w:anchor="fig-3">
+        <w:r>
+          <w:rPr>
+            <w:rStyle w:val="Hyperlink"/>
+          </w:rPr>
+          <w:t xml:space="preserve">Рисунок 3</w:t>
+        </w:r>
+      </w:hyperlink>
+      <w:r>
+        <w:t xml:space="preserve">).</w:t>
       </w:r>
     </w:p>
-    <w:p>
-      <w:pPr>
-        <w:numPr>
-          <w:ilvl w:val="0"/>
-          <w:numId w:val="1004"/>
-        </w:numPr>
-      </w:pPr>
-      <w:r>
-        <w:t xml:space="preserve">Клонирую созданный репозиторий с шаблоном курса с помощью интерфейса GitHub. И копирую ссылку.</w:t>
-      </w:r>
-    </w:p>
-    <w:p>
-      <w:pPr>
-        <w:numPr>
-          <w:ilvl w:val="0"/>
-          <w:numId w:val="1004"/>
-        </w:numPr>
-      </w:pPr>
-      <w:r>
-        <w:t xml:space="preserve">Скопированную ссылку на созданный репозиторий вставляю в терминал.</w:t>
-      </w:r>
-      <w:r>
-        <w:t xml:space="preserve"> </w:t>
-      </w:r>
-      <w:r>
-        <w:t xml:space="preserve">uvzorova@ubuntu:~$ git clone git@github.com:UVZorova/study_2026-2027_arh-pc.git</w:t>
-      </w:r>
-    </w:p>
-    <w:bookmarkEnd w:id="27"/>
-    <w:bookmarkStart w:id="28" w:name="настройка-каталога-курса"/>
-    <w:p>
-      <w:pPr>
-        <w:pStyle w:val="Heading2"/>
-      </w:pPr>
-      <w:r>
-        <w:t xml:space="preserve">4.5 Настройка каталога курса</w:t>
-      </w:r>
-    </w:p>
+    <w:tbl>
+      <w:tblPr>
+        <w:tblStyle w:val="Table"/>
+        <w:tblW w:type="pct" w:w="5000"/>
+        <w:tblLook w:firstRow="0" w:lastRow="0" w:firstColumn="0" w:lastColumn="0" w:noHBand="0" w:noVBand="0" w:val="0000"/>
+        <w:jc w:val="start"/>
+        <w:tblLayout w:type="fixed"/>
+      </w:tblPr>
+      <w:tblGrid>
+        <w:gridCol w:w="7920"/>
+      </w:tblGrid>
+      <w:tr>
+        <w:tc>
+          <w:tcPr/>
+          <w:bookmarkStart w:id="35" w:name="fig-3"/>
+          <w:p>
+            <w:pPr>
+              <w:pStyle w:val="Compact"/>
+              <w:jc w:val="center"/>
+            </w:pPr>
+            <w:r>
+              <w:drawing>
+                <wp:inline>
+                  <wp:extent cx="4267200" cy="2523392"/>
+                  <wp:effectExtent b="0" l="0" r="0" t="0"/>
+                  <wp:docPr descr="" title="" id="33" name="Picture"/>
+                  <a:graphic>
+                    <a:graphicData uri="http://schemas.openxmlformats.org/drawingml/2006/picture">
+                      <pic:pic>
+                        <pic:nvPicPr>
+                          <pic:cNvPr descr="image/3.png" id="34" name="Picture"/>
+                          <pic:cNvPicPr>
+                            <a:picLocks noChangeArrowheads="1" noChangeAspect="1"/>
+                          </pic:cNvPicPr>
+                        </pic:nvPicPr>
+                        <pic:blipFill>
+                          <a:blip r:embed="rId32"/>
+                          <a:stretch>
+                            <a:fillRect/>
+                          </a:stretch>
+                        </pic:blipFill>
+                        <pic:spPr bwMode="auto">
+                          <a:xfrm>
+                            <a:off x="0" y="0"/>
+                            <a:ext cx="4267200" cy="2523392"/>
+                          </a:xfrm>
+                          <a:prstGeom prst="rect">
+                            <a:avLst/>
+                          </a:prstGeom>
+                          <a:noFill/>
+                          <a:ln w="9525">
+                            <a:noFill/>
+                            <a:headEnd/>
+                            <a:tailEnd/>
+                          </a:ln>
+                        </pic:spPr>
+                      </pic:pic>
+                    </a:graphicData>
+                  </a:graphic>
+                </wp:inline>
+              </w:drawing>
+            </w:r>
+          </w:p>
+          <w:p>
+            <w:pPr>
+              <w:jc w:val="center"/>
+            </w:pPr>
+            <w:pPr>
+              <w:jc w:val="start"/>
+              <w:spacing w:before="200"/>
+              <w:pStyle w:val="ImageCaption"/>
+            </w:pPr>
+            <w:r>
+              <w:t xml:space="preserve">Рисунок 3: Создание SSH-ключа</w:t>
+            </w:r>
+          </w:p>
+          <w:bookmarkEnd w:id="35"/>
+        </w:tc>
+      </w:tr>
+    </w:tbl>
     <w:p>
       <w:pPr>
         <w:numPr>
           <w:ilvl w:val="0"/>
           <w:numId w:val="1005"/>
         </w:numPr>
-      </w:pPr>
-      <w:r>
-        <w:t xml:space="preserve">Перехожу в каталог курса, создаю необходимые каталоги и отправляю файлы на сервер.</w:t>
-      </w:r>
-      <w:r>
-        <w:t xml:space="preserve"> </w:t>
-      </w:r>
-      <w:r>
-        <w:t xml:space="preserve">uvzorova@ubuntu:~$ echo arch-pc &gt; COURSE</w:t>
-      </w:r>
-      <w:r>
-        <w:t xml:space="preserve"> </w:t>
-      </w:r>
-      <w:r>
-        <w:t xml:space="preserve">uvzorova@ubuntu:~$ make prepare</w:t>
-      </w:r>
-      <w:r>
-        <w:t xml:space="preserve"> </w:t>
-      </w:r>
-      <w:r>
-        <w:t xml:space="preserve">uvzorova@ubuntu:~$ git add .</w:t>
-      </w:r>
-      <w:r>
-        <w:t xml:space="preserve"> </w:t>
-      </w:r>
-      <w:r>
-        <w:t xml:space="preserve">uvzorova@ubuntu:~$ git commit -am</w:t>
-      </w:r>
-      <w:r>
-        <w:t xml:space="preserve"> </w:t>
-      </w:r>
-      <w:r>
-        <w:t xml:space="preserve">“</w:t>
-      </w:r>
-      <w:r>
-        <w:t xml:space="preserve">feat(main): make course structure</w:t>
-      </w:r>
-      <w:r>
-        <w:t xml:space="preserve">”</w:t>
-      </w:r>
-      <w:r>
-        <w:t xml:space="preserve"> </w:t>
-      </w:r>
-      <w:r>
-        <w:t xml:space="preserve">uvzorova@ubuntu:~$ git push</w:t>
+        <w:pStyle w:val="Compact"/>
+      </w:pPr>
+      <w:r>
+        <w:t xml:space="preserve">Перехожу на сайт GitHub, в настройках выбираю вкладку Ключи SSH/GPG, добавляю созданный ключ (</w:t>
+      </w:r>
+      <w:hyperlink w:anchor="fig-4">
+        <w:r>
+          <w:rPr>
+            <w:rStyle w:val="Hyperlink"/>
+          </w:rPr>
+          <w:t xml:space="preserve">Рисунок 4</w:t>
+        </w:r>
+      </w:hyperlink>
+      <w:r>
+        <w:t xml:space="preserve">).</w:t>
+      </w:r>
+    </w:p>
+    <w:tbl>
+      <w:tblPr>
+        <w:tblStyle w:val="Table"/>
+        <w:tblW w:type="pct" w:w="5000"/>
+        <w:tblLook w:firstRow="0" w:lastRow="0" w:firstColumn="0" w:lastColumn="0" w:noHBand="0" w:noVBand="0" w:val="0000"/>
+        <w:jc w:val="start"/>
+        <w:tblLayout w:type="fixed"/>
+      </w:tblPr>
+      <w:tblGrid>
+        <w:gridCol w:w="7920"/>
+      </w:tblGrid>
+      <w:tr>
+        <w:tc>
+          <w:tcPr/>
+          <w:bookmarkStart w:id="39" w:name="fig-4"/>
+          <w:p>
+            <w:pPr>
+              <w:pStyle w:val="Compact"/>
+              <w:jc w:val="center"/>
+            </w:pPr>
+            <w:r>
+              <w:drawing>
+                <wp:inline>
+                  <wp:extent cx="4267200" cy="1994954"/>
+                  <wp:effectExtent b="0" l="0" r="0" t="0"/>
+                  <wp:docPr descr="" title="" id="37" name="Picture"/>
+                  <a:graphic>
+                    <a:graphicData uri="http://schemas.openxmlformats.org/drawingml/2006/picture">
+                      <pic:pic>
+                        <pic:nvPicPr>
+                          <pic:cNvPr descr="image/4.png" id="38" name="Picture"/>
+                          <pic:cNvPicPr>
+                            <a:picLocks noChangeArrowheads="1" noChangeAspect="1"/>
+                          </pic:cNvPicPr>
+                        </pic:nvPicPr>
+                        <pic:blipFill>
+                          <a:blip r:embed="rId36"/>
+                          <a:stretch>
+                            <a:fillRect/>
+                          </a:stretch>
+                        </pic:blipFill>
+                        <pic:spPr bwMode="auto">
+                          <a:xfrm>
+                            <a:off x="0" y="0"/>
+                            <a:ext cx="4267200" cy="1994954"/>
+                          </a:xfrm>
+                          <a:prstGeom prst="rect">
+                            <a:avLst/>
+                          </a:prstGeom>
+                          <a:noFill/>
+                          <a:ln w="9525">
+                            <a:noFill/>
+                            <a:headEnd/>
+                            <a:tailEnd/>
+                          </a:ln>
+                        </pic:spPr>
+                      </pic:pic>
+                    </a:graphicData>
+                  </a:graphic>
+                </wp:inline>
+              </w:drawing>
+            </w:r>
+          </w:p>
+          <w:p>
+            <w:pPr>
+              <w:jc w:val="center"/>
+            </w:pPr>
+            <w:pPr>
+              <w:jc w:val="start"/>
+              <w:spacing w:before="200"/>
+              <w:pStyle w:val="ImageCaption"/>
+            </w:pPr>
+            <w:r>
+              <w:t xml:space="preserve">Рисунок 4: Добавление SSH-ключа на GitHub</w:t>
+            </w:r>
+          </w:p>
+          <w:bookmarkEnd w:id="39"/>
+        </w:tc>
+      </w:tr>
+    </w:tbl>
+    <w:bookmarkEnd w:id="40"/>
+    <w:bookmarkStart w:id="45" w:name="X5d7ac97f7da9f01eccc91742a7b9d4c637f265e"/>
+    <w:p>
+      <w:pPr>
+        <w:pStyle w:val="Heading2"/>
+      </w:pPr>
+      <w:r>
+        <w:t xml:space="preserve">4.3 Создание рабочего пространства и репозитория курса</w:t>
       </w:r>
     </w:p>
     <w:p>
       <w:pPr>
         <w:numPr>
           <w:ilvl w:val="0"/>
-          <w:numId w:val="1005"/>
+          <w:numId w:val="1006"/>
         </w:numPr>
-      </w:pPr>
-      <w:r>
-        <w:t xml:space="preserve">Захожу в репозиторий в GitHub и проверяю правильность создания иерархии рабочего пространства.</w:t>
+        <w:pStyle w:val="Compact"/>
+      </w:pPr>
+      <w:r>
+        <w:t xml:space="preserve">Создаю структуру рабочих каталогов для учебных материалов (</w:t>
+      </w:r>
+      <w:hyperlink w:anchor="fig-5">
+        <w:r>
+          <w:rPr>
+            <w:rStyle w:val="Hyperlink"/>
+          </w:rPr>
+          <w:t xml:space="preserve">Рисунок 5</w:t>
+        </w:r>
+      </w:hyperlink>
+      <w:r>
+        <w:t xml:space="preserve">).</w:t>
+      </w:r>
+    </w:p>
+    <w:tbl>
+      <w:tblPr>
+        <w:tblStyle w:val="Table"/>
+        <w:tblW w:type="pct" w:w="5000"/>
+        <w:tblLook w:firstRow="0" w:lastRow="0" w:firstColumn="0" w:lastColumn="0" w:noHBand="0" w:noVBand="0" w:val="0000"/>
+        <w:jc w:val="start"/>
+        <w:tblLayout w:type="fixed"/>
+      </w:tblPr>
+      <w:tblGrid>
+        <w:gridCol w:w="7920"/>
+      </w:tblGrid>
+      <w:tr>
+        <w:tc>
+          <w:tcPr/>
+          <w:bookmarkStart w:id="44" w:name="fig-5"/>
+          <w:p>
+            <w:pPr>
+              <w:pStyle w:val="Compact"/>
+              <w:jc w:val="center"/>
+            </w:pPr>
+            <w:r>
+              <w:drawing>
+                <wp:inline>
+                  <wp:extent cx="4267200" cy="147873"/>
+                  <wp:effectExtent b="0" l="0" r="0" t="0"/>
+                  <wp:docPr descr="" title="" id="42" name="Picture"/>
+                  <a:graphic>
+                    <a:graphicData uri="http://schemas.openxmlformats.org/drawingml/2006/picture">
+                      <pic:pic>
+                        <pic:nvPicPr>
+                          <pic:cNvPr descr="image/5.png" id="43" name="Picture"/>
+                          <pic:cNvPicPr>
+                            <a:picLocks noChangeArrowheads="1" noChangeAspect="1"/>
+                          </pic:cNvPicPr>
+                        </pic:nvPicPr>
+                        <pic:blipFill>
+                          <a:blip r:embed="rId41"/>
+                          <a:stretch>
+                            <a:fillRect/>
+                          </a:stretch>
+                        </pic:blipFill>
+                        <pic:spPr bwMode="auto">
+                          <a:xfrm>
+                            <a:off x="0" y="0"/>
+                            <a:ext cx="4267200" cy="147873"/>
+                          </a:xfrm>
+                          <a:prstGeom prst="rect">
+                            <a:avLst/>
+                          </a:prstGeom>
+                          <a:noFill/>
+                          <a:ln w="9525">
+                            <a:noFill/>
+                            <a:headEnd/>
+                            <a:tailEnd/>
+                          </a:ln>
+                        </pic:spPr>
+                      </pic:pic>
+                    </a:graphicData>
+                  </a:graphic>
+                </wp:inline>
+              </w:drawing>
+            </w:r>
+          </w:p>
+          <w:p>
+            <w:pPr>
+              <w:jc w:val="center"/>
+            </w:pPr>
+            <w:pPr>
+              <w:jc w:val="start"/>
+              <w:spacing w:before="200"/>
+              <w:pStyle w:val="ImageCaption"/>
+            </w:pPr>
+            <w:r>
+              <w:t xml:space="preserve">Рисунок 5: Создание структуры каталогов</w:t>
+            </w:r>
+          </w:p>
+          <w:bookmarkEnd w:id="44"/>
+        </w:tc>
+      </w:tr>
+    </w:tbl>
+    <w:bookmarkEnd w:id="45"/>
+    <w:bookmarkStart w:id="62" w:name="X358c05152c0b5375b00f51c960276c4e3312eeb"/>
+    <w:p>
+      <w:pPr>
+        <w:pStyle w:val="Heading2"/>
+      </w:pPr>
+      <w:r>
+        <w:t xml:space="preserve">4.4 Создание репозитория курса на основе шаблона</w:t>
       </w:r>
     </w:p>
     <w:p>
       <w:pPr>
         <w:numPr>
           <w:ilvl w:val="0"/>
-          <w:numId w:val="1005"/>
+          <w:numId w:val="1007"/>
         </w:numPr>
-      </w:pPr>
-      <w:r>
-        <w:t xml:space="preserve">Создаю отчёт по выполнению лабораторной работы, копирую отчёт по выполнению первой лабораторной работы, и загружаю файл в свой репозиторий.</w:t>
+        <w:pStyle w:val="Compact"/>
+      </w:pPr>
+      <w:r>
+        <w:t xml:space="preserve">Создаю репозиторий на основе имеющегося шаблона в GitVerse (</w:t>
+      </w:r>
+      <w:hyperlink w:anchor="fig-6">
+        <w:r>
+          <w:rPr>
+            <w:rStyle w:val="Hyperlink"/>
+          </w:rPr>
+          <w:t xml:space="preserve">Рисунок 6</w:t>
+        </w:r>
+      </w:hyperlink>
+      <w:r>
+        <w:t xml:space="preserve">,</w:t>
+      </w:r>
+      <w:r>
+        <w:t xml:space="preserve"> </w:t>
+      </w:r>
+      <w:hyperlink w:anchor="fig-7">
+        <w:r>
+          <w:rPr>
+            <w:rStyle w:val="Hyperlink"/>
+          </w:rPr>
+          <w:t xml:space="preserve">Рисунок 7</w:t>
+        </w:r>
+      </w:hyperlink>
+      <w:r>
+        <w:t xml:space="preserve">).</w:t>
       </w:r>
     </w:p>
-    <w:bookmarkEnd w:id="28"/>
-    <w:bookmarkEnd w:id="29"/>
-    <w:bookmarkStart w:id="30" w:name="вывод"/>
+    <w:tbl>
+      <w:tblPr>
+        <w:tblStyle w:val="Table"/>
+        <w:tblW w:type="pct" w:w="5000"/>
+        <w:tblLook w:firstRow="0" w:lastRow="0" w:firstColumn="0" w:lastColumn="0" w:noHBand="0" w:noVBand="0" w:val="0000"/>
+        <w:jc w:val="start"/>
+        <w:tblLayout w:type="fixed"/>
+      </w:tblPr>
+      <w:tblGrid>
+        <w:gridCol w:w="7920"/>
+      </w:tblGrid>
+      <w:tr>
+        <w:tc>
+          <w:tcPr/>
+          <w:bookmarkStart w:id="49" w:name="fig-6"/>
+          <w:p>
+            <w:pPr>
+              <w:pStyle w:val="Compact"/>
+              <w:jc w:val="center"/>
+            </w:pPr>
+            <w:r>
+              <w:drawing>
+                <wp:inline>
+                  <wp:extent cx="4267200" cy="3152055"/>
+                  <wp:effectExtent b="0" l="0" r="0" t="0"/>
+                  <wp:docPr descr="" title="" id="47" name="Picture"/>
+                  <a:graphic>
+                    <a:graphicData uri="http://schemas.openxmlformats.org/drawingml/2006/picture">
+                      <pic:pic>
+                        <pic:nvPicPr>
+                          <pic:cNvPr descr="image/6.png" id="48" name="Picture"/>
+                          <pic:cNvPicPr>
+                            <a:picLocks noChangeArrowheads="1" noChangeAspect="1"/>
+                          </pic:cNvPicPr>
+                        </pic:nvPicPr>
+                        <pic:blipFill>
+                          <a:blip r:embed="rId46"/>
+                          <a:stretch>
+                            <a:fillRect/>
+                          </a:stretch>
+                        </pic:blipFill>
+                        <pic:spPr bwMode="auto">
+                          <a:xfrm>
+                            <a:off x="0" y="0"/>
+                            <a:ext cx="4267200" cy="3152055"/>
+                          </a:xfrm>
+                          <a:prstGeom prst="rect">
+                            <a:avLst/>
+                          </a:prstGeom>
+                          <a:noFill/>
+                          <a:ln w="9525">
+                            <a:noFill/>
+                            <a:headEnd/>
+                            <a:tailEnd/>
+                          </a:ln>
+                        </pic:spPr>
+                      </pic:pic>
+                    </a:graphicData>
+                  </a:graphic>
+                </wp:inline>
+              </w:drawing>
+            </w:r>
+          </w:p>
+          <w:p>
+            <w:pPr>
+              <w:jc w:val="center"/>
+            </w:pPr>
+            <w:pPr>
+              <w:jc w:val="start"/>
+              <w:spacing w:before="200"/>
+              <w:pStyle w:val="ImageCaption"/>
+            </w:pPr>
+            <w:r>
+              <w:t xml:space="preserve">Рисунок 6: Шаблон репозитория</w:t>
+            </w:r>
+          </w:p>
+          <w:bookmarkEnd w:id="49"/>
+        </w:tc>
+      </w:tr>
+    </w:tbl>
     <w:p>
       <w:pPr>
-        <w:pStyle w:val="Heading1"/>
-      </w:pPr>
-      <w:r>
-        <w:t xml:space="preserve">5. Вывод</w:t>
+        <w:pStyle w:val="BodyText"/>
+      </w:pPr>
+      <w:r>
+        <w:t xml:space="preserve"> </w:t>
+      </w:r>
+    </w:p>
+    <w:tbl>
+      <w:tblPr>
+        <w:tblStyle w:val="Table"/>
+        <w:tblW w:type="pct" w:w="5000"/>
+        <w:tblLook w:firstRow="0" w:lastRow="0" w:firstColumn="0" w:lastColumn="0" w:noHBand="0" w:noVBand="0" w:val="0000"/>
+        <w:jc w:val="start"/>
+        <w:tblLayout w:type="fixed"/>
+      </w:tblPr>
+      <w:tblGrid>
+        <w:gridCol w:w="7920"/>
+      </w:tblGrid>
+      <w:tr>
+        <w:tc>
+          <w:tcPr/>
+          <w:bookmarkStart w:id="53" w:name="fig-7"/>
+          <w:p>
+            <w:pPr>
+              <w:pStyle w:val="Compact"/>
+              <w:jc w:val="center"/>
+            </w:pPr>
+            <w:r>
+              <w:drawing>
+                <wp:inline>
+                  <wp:extent cx="4267200" cy="2069123"/>
+                  <wp:effectExtent b="0" l="0" r="0" t="0"/>
+                  <wp:docPr descr="" title="" id="51" name="Picture"/>
+                  <a:graphic>
+                    <a:graphicData uri="http://schemas.openxmlformats.org/drawingml/2006/picture">
+                      <pic:pic>
+                        <pic:nvPicPr>
+                          <pic:cNvPr descr="image/7.png" id="52" name="Picture"/>
+                          <pic:cNvPicPr>
+                            <a:picLocks noChangeArrowheads="1" noChangeAspect="1"/>
+                          </pic:cNvPicPr>
+                        </pic:nvPicPr>
+                        <pic:blipFill>
+                          <a:blip r:embed="rId50"/>
+                          <a:stretch>
+                            <a:fillRect/>
+                          </a:stretch>
+                        </pic:blipFill>
+                        <pic:spPr bwMode="auto">
+                          <a:xfrm>
+                            <a:off x="0" y="0"/>
+                            <a:ext cx="4267200" cy="2069123"/>
+                          </a:xfrm>
+                          <a:prstGeom prst="rect">
+                            <a:avLst/>
+                          </a:prstGeom>
+                          <a:noFill/>
+                          <a:ln w="9525">
+                            <a:noFill/>
+                            <a:headEnd/>
+                            <a:tailEnd/>
+                          </a:ln>
+                        </pic:spPr>
+                      </pic:pic>
+                    </a:graphicData>
+                  </a:graphic>
+                </wp:inline>
+              </w:drawing>
+            </w:r>
+          </w:p>
+          <w:p>
+            <w:pPr>
+              <w:jc w:val="center"/>
+            </w:pPr>
+            <w:pPr>
+              <w:jc w:val="start"/>
+              <w:spacing w:before="200"/>
+              <w:pStyle w:val="ImageCaption"/>
+            </w:pPr>
+            <w:r>
+              <w:t xml:space="preserve">Рисунок 7: Создание нового репозитория из шаблона</w:t>
+            </w:r>
+          </w:p>
+          <w:bookmarkEnd w:id="53"/>
+        </w:tc>
+      </w:tr>
+    </w:tbl>
+    <w:p>
+      <w:pPr>
+        <w:numPr>
+          <w:ilvl w:val="0"/>
+          <w:numId w:val="1008"/>
+        </w:numPr>
+        <w:pStyle w:val="Compact"/>
+      </w:pPr>
+      <w:r>
+        <w:t xml:space="preserve">Клонирую созданный репозиторий с шаблоном курса с помощью интерфейса GitHub. И копирую ссылку (</w:t>
+      </w:r>
+      <w:hyperlink w:anchor="fig-8">
+        <w:r>
+          <w:rPr>
+            <w:rStyle w:val="Hyperlink"/>
+          </w:rPr>
+          <w:t xml:space="preserve">Рисунок 8</w:t>
+        </w:r>
+      </w:hyperlink>
+      <w:r>
+        <w:t xml:space="preserve">).</w:t>
+      </w:r>
+    </w:p>
+    <w:tbl>
+      <w:tblPr>
+        <w:tblStyle w:val="Table"/>
+        <w:tblW w:type="pct" w:w="5000"/>
+        <w:tblLook w:firstRow="0" w:lastRow="0" w:firstColumn="0" w:lastColumn="0" w:noHBand="0" w:noVBand="0" w:val="0000"/>
+        <w:jc w:val="start"/>
+        <w:tblLayout w:type="fixed"/>
+      </w:tblPr>
+      <w:tblGrid>
+        <w:gridCol w:w="7920"/>
+      </w:tblGrid>
+      <w:tr>
+        <w:tc>
+          <w:tcPr/>
+          <w:bookmarkStart w:id="57" w:name="fig-8"/>
+          <w:p>
+            <w:pPr>
+              <w:pStyle w:val="Compact"/>
+              <w:jc w:val="center"/>
+            </w:pPr>
+            <w:r>
+              <w:drawing>
+                <wp:inline>
+                  <wp:extent cx="4267200" cy="2612571"/>
+                  <wp:effectExtent b="0" l="0" r="0" t="0"/>
+                  <wp:docPr descr="" title="" id="55" name="Picture"/>
+                  <a:graphic>
+                    <a:graphicData uri="http://schemas.openxmlformats.org/drawingml/2006/picture">
+                      <pic:pic>
+                        <pic:nvPicPr>
+                          <pic:cNvPr descr="image/8.png" id="56" name="Picture"/>
+                          <pic:cNvPicPr>
+                            <a:picLocks noChangeArrowheads="1" noChangeAspect="1"/>
+                          </pic:cNvPicPr>
+                        </pic:nvPicPr>
+                        <pic:blipFill>
+                          <a:blip r:embed="rId54"/>
+                          <a:stretch>
+                            <a:fillRect/>
+                          </a:stretch>
+                        </pic:blipFill>
+                        <pic:spPr bwMode="auto">
+                          <a:xfrm>
+                            <a:off x="0" y="0"/>
+                            <a:ext cx="4267200" cy="2612571"/>
+                          </a:xfrm>
+                          <a:prstGeom prst="rect">
+                            <a:avLst/>
+                          </a:prstGeom>
+                          <a:noFill/>
+                          <a:ln w="9525">
+                            <a:noFill/>
+                            <a:headEnd/>
+                            <a:tailEnd/>
+                          </a:ln>
+                        </pic:spPr>
+                      </pic:pic>
+                    </a:graphicData>
+                  </a:graphic>
+                </wp:inline>
+              </w:drawing>
+            </w:r>
+          </w:p>
+          <w:p>
+            <w:pPr>
+              <w:jc w:val="center"/>
+            </w:pPr>
+            <w:pPr>
+              <w:jc w:val="start"/>
+              <w:spacing w:before="200"/>
+              <w:pStyle w:val="ImageCaption"/>
+            </w:pPr>
+            <w:r>
+              <w:t xml:space="preserve">Рисунок 8: Клонирование репозитория</w:t>
+            </w:r>
+          </w:p>
+          <w:bookmarkEnd w:id="57"/>
+        </w:tc>
+      </w:tr>
+    </w:tbl>
+    <w:p>
+      <w:pPr>
+        <w:numPr>
+          <w:ilvl w:val="0"/>
+          <w:numId w:val="1009"/>
+        </w:numPr>
+        <w:pStyle w:val="Compact"/>
+      </w:pPr>
+      <w:r>
+        <w:t xml:space="preserve">Скопированную ссылку на созданный репозиторий вставляю в терминал (</w:t>
+      </w:r>
+      <w:hyperlink w:anchor="fig-9">
+        <w:r>
+          <w:rPr>
+            <w:rStyle w:val="Hyperlink"/>
+          </w:rPr>
+          <w:t xml:space="preserve">Рисунок 9</w:t>
+        </w:r>
+      </w:hyperlink>
+      <w:r>
+        <w:t xml:space="preserve">).</w:t>
+      </w:r>
+    </w:p>
+    <w:tbl>
+      <w:tblPr>
+        <w:tblStyle w:val="Table"/>
+        <w:tblW w:type="pct" w:w="5000"/>
+        <w:tblLook w:firstRow="0" w:lastRow="0" w:firstColumn="0" w:lastColumn="0" w:noHBand="0" w:noVBand="0" w:val="0000"/>
+        <w:jc w:val="start"/>
+        <w:tblLayout w:type="fixed"/>
+      </w:tblPr>
+      <w:tblGrid>
+        <w:gridCol w:w="7920"/>
+      </w:tblGrid>
+      <w:tr>
+        <w:tc>
+          <w:tcPr/>
+          <w:bookmarkStart w:id="61" w:name="fig-9"/>
+          <w:p>
+            <w:pPr>
+              <w:pStyle w:val="Compact"/>
+              <w:jc w:val="center"/>
+            </w:pPr>
+            <w:r>
+              <w:drawing>
+                <wp:inline>
+                  <wp:extent cx="4267200" cy="705015"/>
+                  <wp:effectExtent b="0" l="0" r="0" t="0"/>
+                  <wp:docPr descr="" title="" id="59" name="Picture"/>
+                  <a:graphic>
+                    <a:graphicData uri="http://schemas.openxmlformats.org/drawingml/2006/picture">
+                      <pic:pic>
+                        <pic:nvPicPr>
+                          <pic:cNvPr descr="image/9.png" id="60" name="Picture"/>
+                          <pic:cNvPicPr>
+                            <a:picLocks noChangeArrowheads="1" noChangeAspect="1"/>
+                          </pic:cNvPicPr>
+                        </pic:nvPicPr>
+                        <pic:blipFill>
+                          <a:blip r:embed="rId58"/>
+                          <a:stretch>
+                            <a:fillRect/>
+                          </a:stretch>
+                        </pic:blipFill>
+                        <pic:spPr bwMode="auto">
+                          <a:xfrm>
+                            <a:off x="0" y="0"/>
+                            <a:ext cx="4267200" cy="705015"/>
+                          </a:xfrm>
+                          <a:prstGeom prst="rect">
+                            <a:avLst/>
+                          </a:prstGeom>
+                          <a:noFill/>
+                          <a:ln w="9525">
+                            <a:noFill/>
+                            <a:headEnd/>
+                            <a:tailEnd/>
+                          </a:ln>
+                        </pic:spPr>
+                      </pic:pic>
+                    </a:graphicData>
+                  </a:graphic>
+                </wp:inline>
+              </w:drawing>
+            </w:r>
+          </w:p>
+          <w:p>
+            <w:pPr>
+              <w:jc w:val="center"/>
+            </w:pPr>
+            <w:pPr>
+              <w:jc w:val="start"/>
+              <w:spacing w:before="200"/>
+              <w:pStyle w:val="ImageCaption"/>
+            </w:pPr>
+            <w:r>
+              <w:t xml:space="preserve">Рисунок 9: Вставка ссылки в терминал</w:t>
+            </w:r>
+          </w:p>
+          <w:bookmarkEnd w:id="61"/>
+        </w:tc>
+      </w:tr>
+    </w:tbl>
+    <w:bookmarkEnd w:id="62"/>
+    <w:bookmarkStart w:id="79" w:name="настройка-каталога-курса"/>
+    <w:p>
+      <w:pPr>
+        <w:pStyle w:val="Heading2"/>
+      </w:pPr>
+      <w:r>
+        <w:t xml:space="preserve">4.5 Настройка каталога курса</w:t>
       </w:r>
     </w:p>
     <w:p>
       <w:pPr>
+        <w:numPr>
+          <w:ilvl w:val="0"/>
+          <w:numId w:val="1010"/>
+        </w:numPr>
+        <w:pStyle w:val="Compact"/>
+      </w:pPr>
+      <w:r>
+        <w:t xml:space="preserve">Перехожу в каталог курса, создаю необходимые каталоги и отправляю файлы на сервер (</w:t>
+      </w:r>
+      <w:hyperlink w:anchor="fig-10">
+        <w:r>
+          <w:rPr>
+            <w:rStyle w:val="Hyperlink"/>
+          </w:rPr>
+          <w:t xml:space="preserve">Рисунок 10</w:t>
+        </w:r>
+      </w:hyperlink>
+      <w:r>
+        <w:t xml:space="preserve">).</w:t>
+      </w:r>
+    </w:p>
+    <w:tbl>
+      <w:tblPr>
+        <w:tblStyle w:val="Table"/>
+        <w:tblW w:type="pct" w:w="5000"/>
+        <w:tblLook w:firstRow="0" w:lastRow="0" w:firstColumn="0" w:lastColumn="0" w:noHBand="0" w:noVBand="0" w:val="0000"/>
+        <w:jc w:val="start"/>
+        <w:tblLayout w:type="fixed"/>
+      </w:tblPr>
+      <w:tblGrid>
+        <w:gridCol w:w="7920"/>
+      </w:tblGrid>
+      <w:tr>
+        <w:tc>
+          <w:tcPr/>
+          <w:bookmarkStart w:id="66" w:name="fig-10"/>
+          <w:p>
+            <w:pPr>
+              <w:pStyle w:val="Compact"/>
+              <w:jc w:val="center"/>
+            </w:pPr>
+            <w:r>
+              <w:drawing>
+                <wp:inline>
+                  <wp:extent cx="4267200" cy="3595116"/>
+                  <wp:effectExtent b="0" l="0" r="0" t="0"/>
+                  <wp:docPr descr="" title="" id="64" name="Picture"/>
+                  <a:graphic>
+                    <a:graphicData uri="http://schemas.openxmlformats.org/drawingml/2006/picture">
+                      <pic:pic>
+                        <pic:nvPicPr>
+                          <pic:cNvPr descr="image/10.png" id="65" name="Picture"/>
+                          <pic:cNvPicPr>
+                            <a:picLocks noChangeArrowheads="1" noChangeAspect="1"/>
+                          </pic:cNvPicPr>
+                        </pic:nvPicPr>
+                        <pic:blipFill>
+                          <a:blip r:embed="rId63"/>
+                          <a:stretch>
+                            <a:fillRect/>
+                          </a:stretch>
+                        </pic:blipFill>
+                        <pic:spPr bwMode="auto">
+                          <a:xfrm>
+                            <a:off x="0" y="0"/>
+                            <a:ext cx="4267200" cy="3595116"/>
+                          </a:xfrm>
+                          <a:prstGeom prst="rect">
+                            <a:avLst/>
+                          </a:prstGeom>
+                          <a:noFill/>
+                          <a:ln w="9525">
+                            <a:noFill/>
+                            <a:headEnd/>
+                            <a:tailEnd/>
+                          </a:ln>
+                        </pic:spPr>
+                      </pic:pic>
+                    </a:graphicData>
+                  </a:graphic>
+                </wp:inline>
+              </w:drawing>
+            </w:r>
+          </w:p>
+          <w:p>
+            <w:pPr>
+              <w:jc w:val="center"/>
+            </w:pPr>
+            <w:pPr>
+              <w:jc w:val="start"/>
+              <w:spacing w:before="200"/>
+              <w:pStyle w:val="ImageCaption"/>
+            </w:pPr>
+            <w:r>
+              <w:t xml:space="preserve">Рисунок 10: Настройка каталога и отправка файлов</w:t>
+            </w:r>
+          </w:p>
+          <w:bookmarkEnd w:id="66"/>
+        </w:tc>
+      </w:tr>
+    </w:tbl>
+    <w:p>
+      <w:pPr>
+        <w:numPr>
+          <w:ilvl w:val="0"/>
+          <w:numId w:val="1011"/>
+        </w:numPr>
+        <w:pStyle w:val="Compact"/>
+      </w:pPr>
+      <w:r>
+        <w:t xml:space="preserve">Захожу в репозиторий в GitHub и проверяю правильность создания иерархии рабочего пространства (</w:t>
+      </w:r>
+      <w:hyperlink w:anchor="fig-11">
+        <w:r>
+          <w:rPr>
+            <w:rStyle w:val="Hyperlink"/>
+          </w:rPr>
+          <w:t xml:space="preserve">Рисунок 11</w:t>
+        </w:r>
+      </w:hyperlink>
+      <w:r>
+        <w:t xml:space="preserve">).</w:t>
+      </w:r>
+    </w:p>
+    <w:tbl>
+      <w:tblPr>
+        <w:tblStyle w:val="Table"/>
+        <w:tblW w:type="pct" w:w="5000"/>
+        <w:tblLook w:firstRow="0" w:lastRow="0" w:firstColumn="0" w:lastColumn="0" w:noHBand="0" w:noVBand="0" w:val="0000"/>
+        <w:jc w:val="start"/>
+        <w:tblLayout w:type="fixed"/>
+      </w:tblPr>
+      <w:tblGrid>
+        <w:gridCol w:w="7920"/>
+      </w:tblGrid>
+      <w:tr>
+        <w:tc>
+          <w:tcPr/>
+          <w:bookmarkStart w:id="70" w:name="fig-11"/>
+          <w:p>
+            <w:pPr>
+              <w:pStyle w:val="Compact"/>
+              <w:jc w:val="center"/>
+            </w:pPr>
+            <w:r>
+              <w:drawing>
+                <wp:inline>
+                  <wp:extent cx="4267200" cy="3318357"/>
+                  <wp:effectExtent b="0" l="0" r="0" t="0"/>
+                  <wp:docPr descr="" title="" id="68" name="Picture"/>
+                  <a:graphic>
+                    <a:graphicData uri="http://schemas.openxmlformats.org/drawingml/2006/picture">
+                      <pic:pic>
+                        <pic:nvPicPr>
+                          <pic:cNvPr descr="image/11.png" id="69" name="Picture"/>
+                          <pic:cNvPicPr>
+                            <a:picLocks noChangeArrowheads="1" noChangeAspect="1"/>
+                          </pic:cNvPicPr>
+                        </pic:nvPicPr>
+                        <pic:blipFill>
+                          <a:blip r:embed="rId67"/>
+                          <a:stretch>
+                            <a:fillRect/>
+                          </a:stretch>
+                        </pic:blipFill>
+                        <pic:spPr bwMode="auto">
+                          <a:xfrm>
+                            <a:off x="0" y="0"/>
+                            <a:ext cx="4267200" cy="3318357"/>
+                          </a:xfrm>
+                          <a:prstGeom prst="rect">
+                            <a:avLst/>
+                          </a:prstGeom>
+                          <a:noFill/>
+                          <a:ln w="9525">
+                            <a:noFill/>
+                            <a:headEnd/>
+                            <a:tailEnd/>
+                          </a:ln>
+                        </pic:spPr>
+                      </pic:pic>
+                    </a:graphicData>
+                  </a:graphic>
+                </wp:inline>
+              </w:drawing>
+            </w:r>
+          </w:p>
+          <w:p>
+            <w:pPr>
+              <w:jc w:val="center"/>
+            </w:pPr>
+            <w:pPr>
+              <w:jc w:val="start"/>
+              <w:spacing w:before="200"/>
+              <w:pStyle w:val="ImageCaption"/>
+            </w:pPr>
+            <w:r>
+              <w:t xml:space="preserve">Рисунок 11: Проверка иерархии на GitHub</w:t>
+            </w:r>
+          </w:p>
+          <w:bookmarkEnd w:id="70"/>
+        </w:tc>
+      </w:tr>
+    </w:tbl>
+    <w:p>
+      <w:pPr>
+        <w:numPr>
+          <w:ilvl w:val="0"/>
+          <w:numId w:val="1012"/>
+        </w:numPr>
+        <w:pStyle w:val="Compact"/>
+      </w:pPr>
+      <w:r>
+        <w:t xml:space="preserve">Создаю отчёт по выполнению лабораторной работы, копирую отчёт по выполнению первой лабораторной работы, и загружаю файл в свой репозиторий (</w:t>
+      </w:r>
+      <w:hyperlink w:anchor="fig-12">
+        <w:r>
+          <w:rPr>
+            <w:rStyle w:val="Hyperlink"/>
+          </w:rPr>
+          <w:t xml:space="preserve">Рисунок 12</w:t>
+        </w:r>
+      </w:hyperlink>
+      <w:r>
+        <w:t xml:space="preserve">).</w:t>
+      </w:r>
+    </w:p>
+    <w:tbl>
+      <w:tblPr>
+        <w:tblStyle w:val="Table"/>
+        <w:tblW w:type="pct" w:w="5000"/>
+        <w:tblLook w:firstRow="0" w:lastRow="0" w:firstColumn="0" w:lastColumn="0" w:noHBand="0" w:noVBand="0" w:val="0000"/>
+        <w:jc w:val="start"/>
+        <w:tblLayout w:type="fixed"/>
+      </w:tblPr>
+      <w:tblGrid>
+        <w:gridCol w:w="7920"/>
+      </w:tblGrid>
+      <w:tr>
+        <w:tc>
+          <w:tcPr/>
+          <w:bookmarkStart w:id="74" w:name="fig-12"/>
+          <w:p>
+            <w:pPr>
+              <w:pStyle w:val="Compact"/>
+              <w:jc w:val="center"/>
+            </w:pPr>
+            <w:r>
+              <w:drawing>
+                <wp:inline>
+                  <wp:extent cx="4267200" cy="1569057"/>
+                  <wp:effectExtent b="0" l="0" r="0" t="0"/>
+                  <wp:docPr descr="" title="" id="72" name="Picture"/>
+                  <a:graphic>
+                    <a:graphicData uri="http://schemas.openxmlformats.org/drawingml/2006/picture">
+                      <pic:pic>
+                        <pic:nvPicPr>
+                          <pic:cNvPr descr="image/12.png" id="73" name="Picture"/>
+                          <pic:cNvPicPr>
+                            <a:picLocks noChangeArrowheads="1" noChangeAspect="1"/>
+                          </pic:cNvPicPr>
+                        </pic:nvPicPr>
+                        <pic:blipFill>
+                          <a:blip r:embed="rId71"/>
+                          <a:stretch>
+                            <a:fillRect/>
+                          </a:stretch>
+                        </pic:blipFill>
+                        <pic:spPr bwMode="auto">
+                          <a:xfrm>
+                            <a:off x="0" y="0"/>
+                            <a:ext cx="4267200" cy="1569057"/>
+                          </a:xfrm>
+                          <a:prstGeom prst="rect">
+                            <a:avLst/>
+                          </a:prstGeom>
+                          <a:noFill/>
+                          <a:ln w="9525">
+                            <a:noFill/>
+                            <a:headEnd/>
+                            <a:tailEnd/>
+                          </a:ln>
+                        </pic:spPr>
+                      </pic:pic>
+                    </a:graphicData>
+                  </a:graphic>
+                </wp:inline>
+              </w:drawing>
+            </w:r>
+          </w:p>
+          <w:p>
+            <w:pPr>
+              <w:jc w:val="center"/>
+            </w:pPr>
+            <w:pPr>
+              <w:jc w:val="start"/>
+              <w:spacing w:before="200"/>
+              <w:pStyle w:val="ImageCaption"/>
+            </w:pPr>
+            <w:r>
+              <w:t xml:space="preserve">Рисунок 12: Загрузка отчета в репозиторий</w:t>
+            </w:r>
+          </w:p>
+          <w:bookmarkEnd w:id="74"/>
+        </w:tc>
+      </w:tr>
+    </w:tbl>
+    <w:p>
+      <w:pPr>
+        <w:numPr>
+          <w:ilvl w:val="0"/>
+          <w:numId w:val="1013"/>
+        </w:numPr>
+        <w:pStyle w:val="Compact"/>
+      </w:pPr>
+      <w:r>
+        <w:t xml:space="preserve">Проверяю корректность выполненных действий на GitHub (</w:t>
+      </w:r>
+      <w:hyperlink w:anchor="fig-13">
+        <w:r>
+          <w:rPr>
+            <w:rStyle w:val="Hyperlink"/>
+          </w:rPr>
+          <w:t xml:space="preserve">Рисунок 13</w:t>
+        </w:r>
+      </w:hyperlink>
+      <w:r>
+        <w:t xml:space="preserve">).</w:t>
+      </w:r>
+    </w:p>
+    <w:tbl>
+      <w:tblPr>
+        <w:tblStyle w:val="Table"/>
+        <w:tblW w:type="pct" w:w="5000"/>
+        <w:tblLook w:firstRow="0" w:lastRow="0" w:firstColumn="0" w:lastColumn="0" w:noHBand="0" w:noVBand="0" w:val="0000"/>
+        <w:jc w:val="start"/>
+        <w:tblLayout w:type="fixed"/>
+      </w:tblPr>
+      <w:tblGrid>
+        <w:gridCol w:w="7920"/>
+      </w:tblGrid>
+      <w:tr>
+        <w:tc>
+          <w:tcPr/>
+          <w:bookmarkStart w:id="78" w:name="fig-13"/>
+          <w:p>
+            <w:pPr>
+              <w:pStyle w:val="Compact"/>
+              <w:jc w:val="center"/>
+            </w:pPr>
+            <w:r>
+              <w:drawing>
+                <wp:inline>
+                  <wp:extent cx="4267200" cy="1290462"/>
+                  <wp:effectExtent b="0" l="0" r="0" t="0"/>
+                  <wp:docPr descr="" title="" id="76" name="Picture"/>
+                  <a:graphic>
+                    <a:graphicData uri="http://schemas.openxmlformats.org/drawingml/2006/picture">
+                      <pic:pic>
+                        <pic:nvPicPr>
+                          <pic:cNvPr descr="image/13.png" id="77" name="Picture"/>
+                          <pic:cNvPicPr>
+                            <a:picLocks noChangeArrowheads="1" noChangeAspect="1"/>
+                          </pic:cNvPicPr>
+                        </pic:nvPicPr>
+                        <pic:blipFill>
+                          <a:blip r:embed="rId75"/>
+                          <a:stretch>
+                            <a:fillRect/>
+                          </a:stretch>
+                        </pic:blipFill>
+                        <pic:spPr bwMode="auto">
+                          <a:xfrm>
+                            <a:off x="0" y="0"/>
+                            <a:ext cx="4267200" cy="1290462"/>
+                          </a:xfrm>
+                          <a:prstGeom prst="rect">
+                            <a:avLst/>
+                          </a:prstGeom>
+                          <a:noFill/>
+                          <a:ln w="9525">
+                            <a:noFill/>
+                            <a:headEnd/>
+                            <a:tailEnd/>
+                          </a:ln>
+                        </pic:spPr>
+                      </pic:pic>
+                    </a:graphicData>
+                  </a:graphic>
+                </wp:inline>
+              </w:drawing>
+            </w:r>
+          </w:p>
+          <w:p>
+            <w:pPr>
+              <w:jc w:val="center"/>
+            </w:pPr>
+            <w:pPr>
+              <w:jc w:val="start"/>
+              <w:spacing w:before="200"/>
+              <w:pStyle w:val="ImageCaption"/>
+            </w:pPr>
+            <w:r>
+              <w:t xml:space="preserve">Рисунок 13: Проверка выполненных действий</w:t>
+            </w:r>
+          </w:p>
+          <w:bookmarkEnd w:id="78"/>
+        </w:tc>
+      </w:tr>
+    </w:tbl>
+    <w:bookmarkEnd w:id="79"/>
+    <w:bookmarkEnd w:id="80"/>
+    <w:bookmarkStart w:id="81" w:name="вывод"/>
+    <w:p>
+      <w:pPr>
+        <w:pStyle w:val="Heading1"/>
+      </w:pPr>
+      <w:r>
+        <w:t xml:space="preserve">5. Вывод</w:t>
+      </w:r>
+    </w:p>
+    <w:p>
+      <w:pPr>
         <w:pStyle w:val="FirstParagraph"/>
       </w:pPr>
       <w:r>
         <w:t xml:space="preserve">В ходе выполнения работы были успешно изучены основные принципы идеологии систем контроля версий и приобретены практические навыки работы с Git. На практике освоены базовые команды и сценарии их применения для управления версиями исходного кода, а также выполнена необходимая настройка для работы с удаленным репозиторием на GitHub.</w:t>
       </w:r>
     </w:p>
-    <w:bookmarkEnd w:id="30"/>
+    <w:bookmarkEnd w:id="81"/>
     <w:sectPr/>
   </w:body>
 </w:document>
@@ -818,6 +1779,261 @@
       </w:pPr>
     </w:lvl>
   </w:abstractNum>
+  <w:abstractNum w:abstractNumId="99422">
+    <w:nsid w:val="A99422"/>
+    <w:multiLevelType w:val="multilevel"/>
+    <w:lvl w:ilvl="0">
+      <w:start w:val="2"/>
+      <w:numFmt w:val="decimal"/>
+      <w:lvlText w:val="%1)"/>
+      <w:lvlJc w:val="left"/>
+      <w:pPr>
+        <w:ind w:left="720" w:hanging="480"/>
+      </w:pPr>
+    </w:lvl>
+    <w:lvl w:ilvl="1">
+      <w:start w:val="2"/>
+      <w:numFmt w:val="decimal"/>
+      <w:lvlText w:val="%2)"/>
+      <w:lvlJc w:val="left"/>
+      <w:pPr>
+        <w:ind w:left="1440" w:hanging="480"/>
+      </w:pPr>
+    </w:lvl>
+    <w:lvl w:ilvl="2">
+      <w:start w:val="2"/>
+      <w:numFmt w:val="decimal"/>
+      <w:lvlText w:val="%3)"/>
+      <w:lvlJc w:val="left"/>
+      <w:pPr>
+        <w:ind w:left="2160" w:hanging="480"/>
+      </w:pPr>
+    </w:lvl>
+    <w:lvl w:ilvl="3">
+      <w:start w:val="2"/>
+      <w:numFmt w:val="decimal"/>
+      <w:lvlText w:val="%4)"/>
+      <w:lvlJc w:val="left"/>
+      <w:pPr>
+        <w:ind w:left="2880" w:hanging="480"/>
+      </w:pPr>
+    </w:lvl>
+    <w:lvl w:ilvl="4">
+      <w:start w:val="2"/>
+      <w:numFmt w:val="decimal"/>
+      <w:lvlText w:val="%5)"/>
+      <w:lvlJc w:val="left"/>
+      <w:pPr>
+        <w:ind w:left="3600" w:hanging="480"/>
+      </w:pPr>
+    </w:lvl>
+    <w:lvl w:ilvl="5">
+      <w:start w:val="2"/>
+      <w:numFmt w:val="decimal"/>
+      <w:lvlText w:val="%6)"/>
+      <w:lvlJc w:val="left"/>
+      <w:pPr>
+        <w:ind w:left="4320" w:hanging="480"/>
+      </w:pPr>
+    </w:lvl>
+    <w:lvl w:ilvl="6">
+      <w:start w:val="2"/>
+      <w:numFmt w:val="decimal"/>
+      <w:lvlText w:val="%7)"/>
+      <w:lvlJc w:val="left"/>
+      <w:pPr>
+        <w:ind w:left="5040" w:hanging="480"/>
+      </w:pPr>
+    </w:lvl>
+    <w:lvl w:ilvl="7">
+      <w:start w:val="2"/>
+      <w:numFmt w:val="decimal"/>
+      <w:lvlText w:val="%8)"/>
+      <w:lvlJc w:val="left"/>
+      <w:pPr>
+        <w:ind w:left="5760" w:hanging="480"/>
+      </w:pPr>
+    </w:lvl>
+    <w:lvl w:ilvl="8">
+      <w:start w:val="2"/>
+      <w:numFmt w:val="decimal"/>
+      <w:lvlText w:val="%9)"/>
+      <w:lvlJc w:val="left"/>
+      <w:pPr>
+        <w:ind w:left="6480" w:hanging="480"/>
+      </w:pPr>
+    </w:lvl>
+  </w:abstractNum>
+  <w:abstractNum w:abstractNumId="99423">
+    <w:nsid w:val="A99423"/>
+    <w:multiLevelType w:val="multilevel"/>
+    <w:lvl w:ilvl="0">
+      <w:start w:val="3"/>
+      <w:numFmt w:val="decimal"/>
+      <w:lvlText w:val="%1)"/>
+      <w:lvlJc w:val="left"/>
+      <w:pPr>
+        <w:ind w:left="720" w:hanging="480"/>
+      </w:pPr>
+    </w:lvl>
+    <w:lvl w:ilvl="1">
+      <w:start w:val="3"/>
+      <w:numFmt w:val="decimal"/>
+      <w:lvlText w:val="%2)"/>
+      <w:lvlJc w:val="left"/>
+      <w:pPr>
+        <w:ind w:left="1440" w:hanging="480"/>
+      </w:pPr>
+    </w:lvl>
+    <w:lvl w:ilvl="2">
+      <w:start w:val="3"/>
+      <w:numFmt w:val="decimal"/>
+      <w:lvlText w:val="%3)"/>
+      <w:lvlJc w:val="left"/>
+      <w:pPr>
+        <w:ind w:left="2160" w:hanging="480"/>
+      </w:pPr>
+    </w:lvl>
+    <w:lvl w:ilvl="3">
+      <w:start w:val="3"/>
+      <w:numFmt w:val="decimal"/>
+      <w:lvlText w:val="%4)"/>
+      <w:lvlJc w:val="left"/>
+      <w:pPr>
+        <w:ind w:left="2880" w:hanging="480"/>
+      </w:pPr>
+    </w:lvl>
+    <w:lvl w:ilvl="4">
+      <w:start w:val="3"/>
+      <w:numFmt w:val="decimal"/>
+      <w:lvlText w:val="%5)"/>
+      <w:lvlJc w:val="left"/>
+      <w:pPr>
+        <w:ind w:left="3600" w:hanging="480"/>
+      </w:pPr>
+    </w:lvl>
+    <w:lvl w:ilvl="5">
+      <w:start w:val="3"/>
+      <w:numFmt w:val="decimal"/>
+      <w:lvlText w:val="%6)"/>
+      <w:lvlJc w:val="left"/>
+      <w:pPr>
+        <w:ind w:left="4320" w:hanging="480"/>
+      </w:pPr>
+    </w:lvl>
+    <w:lvl w:ilvl="6">
+      <w:start w:val="3"/>
+      <w:numFmt w:val="decimal"/>
+      <w:lvlText w:val="%7)"/>
+      <w:lvlJc w:val="left"/>
+      <w:pPr>
+        <w:ind w:left="5040" w:hanging="480"/>
+      </w:pPr>
+    </w:lvl>
+    <w:lvl w:ilvl="7">
+      <w:start w:val="3"/>
+      <w:numFmt w:val="decimal"/>
+      <w:lvlText w:val="%8)"/>
+      <w:lvlJc w:val="left"/>
+      <w:pPr>
+        <w:ind w:left="5760" w:hanging="480"/>
+      </w:pPr>
+    </w:lvl>
+    <w:lvl w:ilvl="8">
+      <w:start w:val="3"/>
+      <w:numFmt w:val="decimal"/>
+      <w:lvlText w:val="%9)"/>
+      <w:lvlJc w:val="left"/>
+      <w:pPr>
+        <w:ind w:left="6480" w:hanging="480"/>
+      </w:pPr>
+    </w:lvl>
+  </w:abstractNum>
+  <w:abstractNum w:abstractNumId="99424">
+    <w:nsid w:val="A99424"/>
+    <w:multiLevelType w:val="multilevel"/>
+    <w:lvl w:ilvl="0">
+      <w:start w:val="4"/>
+      <w:numFmt w:val="decimal"/>
+      <w:lvlText w:val="%1)"/>
+      <w:lvlJc w:val="left"/>
+      <w:pPr>
+        <w:ind w:left="720" w:hanging="480"/>
+      </w:pPr>
+    </w:lvl>
+    <w:lvl w:ilvl="1">
+      <w:start w:val="4"/>
+      <w:numFmt w:val="decimal"/>
+      <w:lvlText w:val="%2)"/>
+      <w:lvlJc w:val="left"/>
+      <w:pPr>
+        <w:ind w:left="1440" w:hanging="480"/>
+      </w:pPr>
+    </w:lvl>
+    <w:lvl w:ilvl="2">
+      <w:start w:val="4"/>
+      <w:numFmt w:val="decimal"/>
+      <w:lvlText w:val="%3)"/>
+      <w:lvlJc w:val="left"/>
+      <w:pPr>
+        <w:ind w:left="2160" w:hanging="480"/>
+      </w:pPr>
+    </w:lvl>
+    <w:lvl w:ilvl="3">
+      <w:start w:val="4"/>
+      <w:numFmt w:val="decimal"/>
+      <w:lvlText w:val="%4)"/>
+      <w:lvlJc w:val="left"/>
+      <w:pPr>
+        <w:ind w:left="2880" w:hanging="480"/>
+      </w:pPr>
+    </w:lvl>
+    <w:lvl w:ilvl="4">
+      <w:start w:val="4"/>
+      <w:numFmt w:val="decimal"/>
+      <w:lvlText w:val="%5)"/>
+      <w:lvlJc w:val="left"/>
+      <w:pPr>
+        <w:ind w:left="3600" w:hanging="480"/>
+      </w:pPr>
+    </w:lvl>
+    <w:lvl w:ilvl="5">
+      <w:start w:val="4"/>
+      <w:numFmt w:val="decimal"/>
+      <w:lvlText w:val="%6)"/>
+      <w:lvlJc w:val="left"/>
+      <w:pPr>
+        <w:ind w:left="4320" w:hanging="480"/>
+      </w:pPr>
+    </w:lvl>
+    <w:lvl w:ilvl="6">
+      <w:start w:val="4"/>
+      <w:numFmt w:val="decimal"/>
+      <w:lvlText w:val="%7)"/>
+      <w:lvlJc w:val="left"/>
+      <w:pPr>
+        <w:ind w:left="5040" w:hanging="480"/>
+      </w:pPr>
+    </w:lvl>
+    <w:lvl w:ilvl="7">
+      <w:start w:val="4"/>
+      <w:numFmt w:val="decimal"/>
+      <w:lvlText w:val="%8)"/>
+      <w:lvlJc w:val="left"/>
+      <w:pPr>
+        <w:ind w:left="5760" w:hanging="480"/>
+      </w:pPr>
+    </w:lvl>
+    <w:lvl w:ilvl="8">
+      <w:start w:val="4"/>
+      <w:numFmt w:val="decimal"/>
+      <w:lvlText w:val="%9)"/>
+      <w:lvlJc w:val="left"/>
+      <w:pPr>
+        <w:ind w:left="6480" w:hanging="480"/>
+      </w:pPr>
+    </w:lvl>
+  </w:abstractNum>
   <w:num w:numId="1000">
     <w:abstractNumId w:val="990"/>
   </w:num>
@@ -882,6 +2098,96 @@
     </w:lvlOverride>
   </w:num>
   <w:num w:numId="1003">
+    <w:abstractNumId w:val="99422"/>
+    <w:lvlOverride w:ilvl="0">
+      <w:startOverride w:val="2"/>
+    </w:lvlOverride>
+    <w:lvlOverride w:ilvl="1">
+      <w:startOverride w:val="2"/>
+    </w:lvlOverride>
+    <w:lvlOverride w:ilvl="2">
+      <w:startOverride w:val="2"/>
+    </w:lvlOverride>
+    <w:lvlOverride w:ilvl="3">
+      <w:startOverride w:val="2"/>
+    </w:lvlOverride>
+    <w:lvlOverride w:ilvl="4">
+      <w:startOverride w:val="2"/>
+    </w:lvlOverride>
+    <w:lvlOverride w:ilvl="5">
+      <w:startOverride w:val="2"/>
+    </w:lvlOverride>
+    <w:lvlOverride w:ilvl="6">
+      <w:startOverride w:val="2"/>
+    </w:lvlOverride>
+    <w:lvlOverride w:ilvl="7">
+      <w:startOverride w:val="2"/>
+    </w:lvlOverride>
+    <w:lvlOverride w:ilvl="8">
+      <w:startOverride w:val="2"/>
+    </w:lvlOverride>
+  </w:num>
+  <w:num w:numId="1004">
+    <w:abstractNumId w:val="99423"/>
+    <w:lvlOverride w:ilvl="0">
+      <w:startOverride w:val="3"/>
+    </w:lvlOverride>
+    <w:lvlOverride w:ilvl="1">
+      <w:startOverride w:val="3"/>
+    </w:lvlOverride>
+    <w:lvlOverride w:ilvl="2">
+      <w:startOverride w:val="3"/>
+    </w:lvlOverride>
+    <w:lvlOverride w:ilvl="3">
+      <w:startOverride w:val="3"/>
+    </w:lvlOverride>
+    <w:lvlOverride w:ilvl="4">
+      <w:startOverride w:val="3"/>
+    </w:lvlOverride>
+    <w:lvlOverride w:ilvl="5">
+      <w:startOverride w:val="3"/>
+    </w:lvlOverride>
+    <w:lvlOverride w:ilvl="6">
+      <w:startOverride w:val="3"/>
+    </w:lvlOverride>
+    <w:lvlOverride w:ilvl="7">
+      <w:startOverride w:val="3"/>
+    </w:lvlOverride>
+    <w:lvlOverride w:ilvl="8">
+      <w:startOverride w:val="3"/>
+    </w:lvlOverride>
+  </w:num>
+  <w:num w:numId="1005">
+    <w:abstractNumId w:val="99424"/>
+    <w:lvlOverride w:ilvl="0">
+      <w:startOverride w:val="4"/>
+    </w:lvlOverride>
+    <w:lvlOverride w:ilvl="1">
+      <w:startOverride w:val="4"/>
+    </w:lvlOverride>
+    <w:lvlOverride w:ilvl="2">
+      <w:startOverride w:val="4"/>
+    </w:lvlOverride>
+    <w:lvlOverride w:ilvl="3">
+      <w:startOverride w:val="4"/>
+    </w:lvlOverride>
+    <w:lvlOverride w:ilvl="4">
+      <w:startOverride w:val="4"/>
+    </w:lvlOverride>
+    <w:lvlOverride w:ilvl="5">
+      <w:startOverride w:val="4"/>
+    </w:lvlOverride>
+    <w:lvlOverride w:ilvl="6">
+      <w:startOverride w:val="4"/>
+    </w:lvlOverride>
+    <w:lvlOverride w:ilvl="7">
+      <w:startOverride w:val="4"/>
+    </w:lvlOverride>
+    <w:lvlOverride w:ilvl="8">
+      <w:startOverride w:val="4"/>
+    </w:lvlOverride>
+  </w:num>
+  <w:num w:numId="1006">
     <w:abstractNumId w:val="99421"/>
     <w:lvlOverride w:ilvl="0">
       <w:startOverride w:val="1"/>
@@ -911,7 +2217,7 @@
       <w:startOverride w:val="1"/>
     </w:lvlOverride>
   </w:num>
-  <w:num w:numId="1004">
+  <w:num w:numId="1007">
     <w:abstractNumId w:val="99421"/>
     <w:lvlOverride w:ilvl="0">
       <w:startOverride w:val="1"/>
@@ -941,7 +2247,67 @@
       <w:startOverride w:val="1"/>
     </w:lvlOverride>
   </w:num>
-  <w:num w:numId="1005">
+  <w:num w:numId="1008">
+    <w:abstractNumId w:val="99422"/>
+    <w:lvlOverride w:ilvl="0">
+      <w:startOverride w:val="2"/>
+    </w:lvlOverride>
+    <w:lvlOverride w:ilvl="1">
+      <w:startOverride w:val="2"/>
+    </w:lvlOverride>
+    <w:lvlOverride w:ilvl="2">
+      <w:startOverride w:val="2"/>
+    </w:lvlOverride>
+    <w:lvlOverride w:ilvl="3">
+      <w:startOverride w:val="2"/>
+    </w:lvlOverride>
+    <w:lvlOverride w:ilvl="4">
+      <w:startOverride w:val="2"/>
+    </w:lvlOverride>
+    <w:lvlOverride w:ilvl="5">
+      <w:startOverride w:val="2"/>
+    </w:lvlOverride>
+    <w:lvlOverride w:ilvl="6">
+      <w:startOverride w:val="2"/>
+    </w:lvlOverride>
+    <w:lvlOverride w:ilvl="7">
+      <w:startOverride w:val="2"/>
+    </w:lvlOverride>
+    <w:lvlOverride w:ilvl="8">
+      <w:startOverride w:val="2"/>
+    </w:lvlOverride>
+  </w:num>
+  <w:num w:numId="1009">
+    <w:abstractNumId w:val="99423"/>
+    <w:lvlOverride w:ilvl="0">
+      <w:startOverride w:val="3"/>
+    </w:lvlOverride>
+    <w:lvlOverride w:ilvl="1">
+      <w:startOverride w:val="3"/>
+    </w:lvlOverride>
+    <w:lvlOverride w:ilvl="2">
+      <w:startOverride w:val="3"/>
+    </w:lvlOverride>
+    <w:lvlOverride w:ilvl="3">
+      <w:startOverride w:val="3"/>
+    </w:lvlOverride>
+    <w:lvlOverride w:ilvl="4">
+      <w:startOverride w:val="3"/>
+    </w:lvlOverride>
+    <w:lvlOverride w:ilvl="5">
+      <w:startOverride w:val="3"/>
+    </w:lvlOverride>
+    <w:lvlOverride w:ilvl="6">
+      <w:startOverride w:val="3"/>
+    </w:lvlOverride>
+    <w:lvlOverride w:ilvl="7">
+      <w:startOverride w:val="3"/>
+    </w:lvlOverride>
+    <w:lvlOverride w:ilvl="8">
+      <w:startOverride w:val="3"/>
+    </w:lvlOverride>
+  </w:num>
+  <w:num w:numId="1010">
     <w:abstractNumId w:val="99421"/>
     <w:lvlOverride w:ilvl="0">
       <w:startOverride w:val="1"/>
@@ -969,6 +2335,96 @@
     </w:lvlOverride>
     <w:lvlOverride w:ilvl="8">
       <w:startOverride w:val="1"/>
+    </w:lvlOverride>
+  </w:num>
+  <w:num w:numId="1011">
+    <w:abstractNumId w:val="99422"/>
+    <w:lvlOverride w:ilvl="0">
+      <w:startOverride w:val="2"/>
+    </w:lvlOverride>
+    <w:lvlOverride w:ilvl="1">
+      <w:startOverride w:val="2"/>
+    </w:lvlOverride>
+    <w:lvlOverride w:ilvl="2">
+      <w:startOverride w:val="2"/>
+    </w:lvlOverride>
+    <w:lvlOverride w:ilvl="3">
+      <w:startOverride w:val="2"/>
+    </w:lvlOverride>
+    <w:lvlOverride w:ilvl="4">
+      <w:startOverride w:val="2"/>
+    </w:lvlOverride>
+    <w:lvlOverride w:ilvl="5">
+      <w:startOverride w:val="2"/>
+    </w:lvlOverride>
+    <w:lvlOverride w:ilvl="6">
+      <w:startOverride w:val="2"/>
+    </w:lvlOverride>
+    <w:lvlOverride w:ilvl="7">
+      <w:startOverride w:val="2"/>
+    </w:lvlOverride>
+    <w:lvlOverride w:ilvl="8">
+      <w:startOverride w:val="2"/>
+    </w:lvlOverride>
+  </w:num>
+  <w:num w:numId="1012">
+    <w:abstractNumId w:val="99423"/>
+    <w:lvlOverride w:ilvl="0">
+      <w:startOverride w:val="3"/>
+    </w:lvlOverride>
+    <w:lvlOverride w:ilvl="1">
+      <w:startOverride w:val="3"/>
+    </w:lvlOverride>
+    <w:lvlOverride w:ilvl="2">
+      <w:startOverride w:val="3"/>
+    </w:lvlOverride>
+    <w:lvlOverride w:ilvl="3">
+      <w:startOverride w:val="3"/>
+    </w:lvlOverride>
+    <w:lvlOverride w:ilvl="4">
+      <w:startOverride w:val="3"/>
+    </w:lvlOverride>
+    <w:lvlOverride w:ilvl="5">
+      <w:startOverride w:val="3"/>
+    </w:lvlOverride>
+    <w:lvlOverride w:ilvl="6">
+      <w:startOverride w:val="3"/>
+    </w:lvlOverride>
+    <w:lvlOverride w:ilvl="7">
+      <w:startOverride w:val="3"/>
+    </w:lvlOverride>
+    <w:lvlOverride w:ilvl="8">
+      <w:startOverride w:val="3"/>
+    </w:lvlOverride>
+  </w:num>
+  <w:num w:numId="1013">
+    <w:abstractNumId w:val="99424"/>
+    <w:lvlOverride w:ilvl="0">
+      <w:startOverride w:val="4"/>
+    </w:lvlOverride>
+    <w:lvlOverride w:ilvl="1">
+      <w:startOverride w:val="4"/>
+    </w:lvlOverride>
+    <w:lvlOverride w:ilvl="2">
+      <w:startOverride w:val="4"/>
+    </w:lvlOverride>
+    <w:lvlOverride w:ilvl="3">
+      <w:startOverride w:val="4"/>
+    </w:lvlOverride>
+    <w:lvlOverride w:ilvl="4">
+      <w:startOverride w:val="4"/>
+    </w:lvlOverride>
+    <w:lvlOverride w:ilvl="5">
+      <w:startOverride w:val="4"/>
+    </w:lvlOverride>
+    <w:lvlOverride w:ilvl="6">
+      <w:startOverride w:val="4"/>
+    </w:lvlOverride>
+    <w:lvlOverride w:ilvl="7">
+      <w:startOverride w:val="4"/>
+    </w:lvlOverride>
+    <w:lvlOverride w:ilvl="8">
+      <w:startOverride w:val="4"/>
     </w:lvlOverride>
   </w:num>
 </w:numbering>

</xml_diff>